<commit_message>
Briefing IT-Ingenieur JANS AI Zentrum: Anfrage, Briefing, Beilage Ist/Soll, Befundkatalog (120 Befunde), Begleitnotiz; Fristen-Eintrag bexio 02.10.; Wissens-Ruecklauf claude-code
</commit_message>
<xml_diff>
--- a/docs/konzepte/260919-Briefing-IT-Ingenieur-JANS-AI-Zentrum/260919-Anfrage-IT-Ingenieur-JANS-AI-Zentrum.docx
+++ b/docs/konzepte/260919-Briefing-IT-Ingenieur-JANS-AI-Zentrum/260919-Anfrage-IT-Ingenieur-JANS-AI-Zentrum.docx
@@ -628,7 +628,7 @@
         <w:t>02.2 Randbedingungen.</w:t>
       </w:r>
       <w:r>
-        <w:t xml:space="preserve"> macOS bleibt für CAD, Render und Layout, Microsoft 365 und bexio bleiben, Claude bleibt die KI-Engine. Schweizer DSG, ein Teil der Bauherrschaften stellt erhöhte Anforderungen an Vertraulichkeit. Das Büro hat keine IT-Fachperson und sucht eine Lösung mit Wartungsvertrag. Umbau in Etappen mit Parallelbetrieb und Haltepunkten, die laufenden Bauprojekte dürfen nicht stehen.</w:t>
+        <w:t xml:space="preserve"> macOS bleibt für CAD, Render und Layout; Microsoft 365 und bexio bleiben; Claude bleibt die KI-Engine. Es gilt das Schweizer DSG. Ein Teil der Bauherrschaften stellt erhöhte Anforderungen an Vertraulichkeit. Das Büro hat keine IT-Fachperson und sucht eine Lösung mit Wartungsvertrag. Umbau in Etappen mit Parallelbetrieb und Haltepunkten, die laufenden Bauprojekte dürfen nicht stehen.</w:t>
       </w:r>
     </w:p>
     <w:p>
@@ -688,7 +688,7 @@
         <w:t>04.2 Geheimhaltung.</w:t>
       </w:r>
       <w:r>
-        <w:t xml:space="preserve"> Darauf erhalten Sie die Geheimhaltungsvereinbarung des Büros. Nach Unterzeichnung folgen das Briefing (rund zwölf Seiten mit Befund, Zielbild, Paketen und Abnahmekriterien) und die Architektur-Beilage. Der Befundkatalog mit 120 belegten Befunden liegt an der Begehung zur Einsicht auf.</w:t>
+        <w:t xml:space="preserve"> Darauf erhalten Sie die Geheimhaltungsvereinbarung des Büros. Nach Unterzeichnung folgen das Briefing (rund dreizehn Seiten mit Befund, Zielbild, Paketen und Abnahmekriterien) und die Architektur-Beilage. Der Befundkatalog mit 120 belegten Befunden liegt an der Begehung zur Einsicht auf.</w:t>
       </w:r>
     </w:p>
     <w:p>
@@ -710,7 +710,7 @@
         <w:t>04.4 Offerte.</w:t>
       </w:r>
       <w:r>
-        <w:t xml:space="preserve"> AP0 als Festpreis, Stundenansätze, Richtpreise je Paket mit Annahmen, Wartungspauschale. Eingang bis ________________.</w:t>
+        <w:t xml:space="preserve"> AP0 als Festpreis mit Kostendach für die Sofortmassnahmen, Stundenansätze, Richtpreise je Paket mit Annahmen, Richtwert der Wartung. Eingang bis ________________.</w:t>
       </w:r>
     </w:p>
     <w:p>

</xml_diff>